<commit_message>
Justifica título e banca e distribui espaço entre os membros
</commit_message>
<xml_diff>
--- a/qualificacao_doutorado/exemplo_gerado/Cartaz - ADRIAN SOUZA DOS SANTOS.docx
+++ b/qualificacao_doutorado/exemplo_gerado/Cartaz - ADRIAN SOUZA DOS SANTOS.docx
@@ -101,7 +101,7 @@
                           <w:p>
                             <w:pPr>
                               <w:spacing w:before="0" w:after="0" w:line="408" w:lineRule="exact"/>
-                              <w:jc w:val="left"/>
+                              <w:jc w:val="both"/>
                               <w:widowControl w:val="0"/>
                             </w:pPr>
                             <w:r>
@@ -137,7 +137,7 @@
                     <w:p>
                       <w:pPr>
                         <w:spacing w:before="0" w:after="0" w:line="408" w:lineRule="exact"/>
-                        <w:jc w:val="left"/>
+                        <w:jc w:val="both"/>
                         <w:widowControl w:val="0"/>
                       </w:pPr>
                       <w:r>
@@ -408,8 +408,8 @@
                         <w:txbxContent>
                           <w:p>
                             <w:pPr>
-                              <w:spacing w:before="0" w:after="100" w:line="396" w:lineRule="exact"/>
-                              <w:jc w:val="left"/>
+                              <w:spacing w:before="0" w:after="232" w:line="396" w:lineRule="exact"/>
+                              <w:jc w:val="both"/>
                               <w:widowControl w:val="0"/>
                             </w:pPr>
                             <w:r>
@@ -424,8 +424,8 @@
                           </w:p>
                           <w:p>
                             <w:pPr>
-                              <w:spacing w:before="0" w:after="100" w:line="396" w:lineRule="exact"/>
-                              <w:jc w:val="left"/>
+                              <w:spacing w:before="0" w:after="232" w:line="396" w:lineRule="exact"/>
+                              <w:jc w:val="both"/>
                               <w:widowControl w:val="0"/>
                             </w:pPr>
                             <w:r>
@@ -440,8 +440,8 @@
                           </w:p>
                           <w:p>
                             <w:pPr>
-                              <w:spacing w:before="0" w:after="100" w:line="396" w:lineRule="exact"/>
-                              <w:jc w:val="left"/>
+                              <w:spacing w:before="0" w:after="232" w:line="396" w:lineRule="exact"/>
+                              <w:jc w:val="both"/>
                               <w:widowControl w:val="0"/>
                             </w:pPr>
                             <w:r>
@@ -456,8 +456,8 @@
                           </w:p>
                           <w:p>
                             <w:pPr>
-                              <w:spacing w:before="0" w:after="100" w:line="396" w:lineRule="exact"/>
-                              <w:jc w:val="left"/>
+                              <w:spacing w:before="0" w:after="232" w:line="396" w:lineRule="exact"/>
+                              <w:jc w:val="both"/>
                               <w:widowControl w:val="0"/>
                             </w:pPr>
                             <w:r>
@@ -472,8 +472,8 @@
                           </w:p>
                           <w:p>
                             <w:pPr>
-                              <w:spacing w:before="0" w:after="100" w:line="396" w:lineRule="exact"/>
-                              <w:jc w:val="left"/>
+                              <w:spacing w:before="0" w:after="232" w:line="396" w:lineRule="exact"/>
+                              <w:jc w:val="both"/>
                               <w:widowControl w:val="0"/>
                             </w:pPr>
                             <w:r>
@@ -490,8 +490,8 @@
                           </w:p>
                           <w:p>
                             <w:pPr>
-                              <w:spacing w:before="0" w:after="100" w:line="396" w:lineRule="exact"/>
-                              <w:jc w:val="left"/>
+                              <w:spacing w:before="0" w:after="232" w:line="396" w:lineRule="exact"/>
+                              <w:jc w:val="both"/>
                               <w:widowControl w:val="0"/>
                             </w:pPr>
                             <w:r>
@@ -507,7 +507,7 @@
                           <w:p>
                             <w:pPr>
                               <w:spacing w:before="0" w:after="0" w:line="396" w:lineRule="exact"/>
-                              <w:jc w:val="left"/>
+                              <w:jc w:val="both"/>
                               <w:widowControl w:val="0"/>
                             </w:pPr>
                             <w:r>
@@ -538,8 +538,8 @@
                   <w:txbxContent>
                     <w:p>
                       <w:pPr>
-                        <w:spacing w:before="0" w:after="100" w:line="396" w:lineRule="exact"/>
-                        <w:jc w:val="left"/>
+                        <w:spacing w:before="0" w:after="232" w:line="396" w:lineRule="exact"/>
+                        <w:jc w:val="both"/>
                         <w:widowControl w:val="0"/>
                       </w:pPr>
                       <w:r>
@@ -554,8 +554,8 @@
                     </w:p>
                     <w:p>
                       <w:pPr>
-                        <w:spacing w:before="0" w:after="100" w:line="396" w:lineRule="exact"/>
-                        <w:jc w:val="left"/>
+                        <w:spacing w:before="0" w:after="232" w:line="396" w:lineRule="exact"/>
+                        <w:jc w:val="both"/>
                         <w:widowControl w:val="0"/>
                       </w:pPr>
                       <w:r>
@@ -570,8 +570,8 @@
                     </w:p>
                     <w:p>
                       <w:pPr>
-                        <w:spacing w:before="0" w:after="100" w:line="396" w:lineRule="exact"/>
-                        <w:jc w:val="left"/>
+                        <w:spacing w:before="0" w:after="232" w:line="396" w:lineRule="exact"/>
+                        <w:jc w:val="both"/>
                         <w:widowControl w:val="0"/>
                       </w:pPr>
                       <w:r>
@@ -586,8 +586,8 @@
                     </w:p>
                     <w:p>
                       <w:pPr>
-                        <w:spacing w:before="0" w:after="100" w:line="396" w:lineRule="exact"/>
-                        <w:jc w:val="left"/>
+                        <w:spacing w:before="0" w:after="232" w:line="396" w:lineRule="exact"/>
+                        <w:jc w:val="both"/>
                         <w:widowControl w:val="0"/>
                       </w:pPr>
                       <w:r>
@@ -602,8 +602,8 @@
                     </w:p>
                     <w:p>
                       <w:pPr>
-                        <w:spacing w:before="0" w:after="100" w:line="396" w:lineRule="exact"/>
-                        <w:jc w:val="left"/>
+                        <w:spacing w:before="0" w:after="232" w:line="396" w:lineRule="exact"/>
+                        <w:jc w:val="both"/>
                         <w:widowControl w:val="0"/>
                       </w:pPr>
                       <w:r>
@@ -620,8 +620,8 @@
                     </w:p>
                     <w:p>
                       <w:pPr>
-                        <w:spacing w:before="0" w:after="100" w:line="396" w:lineRule="exact"/>
-                        <w:jc w:val="left"/>
+                        <w:spacing w:before="0" w:after="232" w:line="396" w:lineRule="exact"/>
+                        <w:jc w:val="both"/>
                         <w:widowControl w:val="0"/>
                       </w:pPr>
                       <w:r>
@@ -637,7 +637,7 @@
                     <w:p>
                       <w:pPr>
                         <w:spacing w:before="0" w:after="0" w:line="396" w:lineRule="exact"/>
-                        <w:jc w:val="left"/>
+                        <w:jc w:val="both"/>
                         <w:widowControl w:val="0"/>
                       </w:pPr>
                       <w:r>

</xml_diff>